<commit_message>
Panel review: fix the scrambled Theoretical Framework section
The Theoretical Framework heading sat AFTER its own content, the three theory
paragraphs ran in reverse logical order, and the two framework headings sat
back to back with nothing between them. Reordered so the section reads:
heading -> introduce the organisational-justice model (Gilliland, 1993) ->
why it is relevant to automated screening -> how the system's design responds
to it, then the Conceptual Framework. No wording changed; only paragraph order
and heading placement.

Co-Authored-By: Claude Opus 5 <noreply@anthropic.com>
Claude-Session: https://claude.ai/code/session_01KJCBhwXyDj1kaiQWF9G7ZP
</commit_message>
<xml_diff>
--- a/05_Website_Angular/docs/Linaw-PH-MAIN-PAPER-updated.docx
+++ b/05_Website_Angular/docs/Linaw-PH-MAIN-PAPER-updated.docx
@@ -2005,6 +2005,71 @@
     </w:p>
     <w:p>
       <w:pPr>
+        <w:pStyle w:val="Heading1"/>
+        <w:spacing w:line="480" w:lineRule="auto"/>
+        <w:ind w:firstLine="720"/>
+        <w:jc w:val="both"/>
+        <w:rPr>
+          <w:sz w:val="20"/>
+          <w:szCs w:val="20"/>
+        </w:rPr>
+      </w:pPr>
+      <w:r>
+        <w:rPr>
+          <w:color w:val="1a1a1a"/>
+          <w:rtl w:val="0"/>
+        </w:rPr>
+        <w:t xml:space="preserve">Theoretical Framework</w:t>
+      </w:r>
+      <w:r>
+        <w:rPr>
+          <w:rtl w:val="0"/>
+        </w:rPr>
+      </w:r>
+    </w:p>
+    <w:p>
+      <w:pPr>
+        <w:spacing w:line="480" w:lineRule="auto"/>
+        <w:ind w:firstLine="720"/>
+        <w:jc w:val="both"/>
+        <w:rPr>
+          <w:sz w:val="20"/>
+          <w:szCs w:val="20"/>
+        </w:rPr>
+      </w:pPr>
+      <w:r>
+        <w:rPr>
+          <w:color w:val="1a1a1a"/>
+          <w:rtl w:val="0"/>
+        </w:rPr>
+        <w:t>This study is grounded in organisational justice theory as it applies to personnel selection, and specifically in the model advanced by Gilliland (1993). That model proposes that applicants form judgements about the fairness of a selection system according to a set of procedural rules, rather than solely according to whether they are chosen. Among those rules are whether the basis of a decision is related to the job, whether applicants are given adequate information and explanation about how they are being assessed, and whether the procedure is applied consistently from one applicant to the next. The model holds that these perceptions matter in their own right, because they affect how applicants regard the organisation and whether they continue to pursue it.</w:t>
+      </w:r>
+    </w:p>
+    <w:p>
+      <w:pPr>
+        <w:spacing w:line="480" w:lineRule="auto"/>
+        <w:ind w:firstLine="720"/>
+        <w:jc w:val="both"/>
+        <w:rPr>
+          <w:sz w:val="20"/>
+          <w:szCs w:val="20"/>
+        </w:rPr>
+      </w:pPr>
+      <w:r>
+        <w:rPr>
+          <w:color w:val="1a1a1a"/>
+          <w:rtl w:val="0"/>
+        </w:rPr>
+        <w:t xml:space="preserve">This theory is relevant to the present study because automated screening removes precisely the elements the model identifies as sources of perceived fairness. An applicant filtered out by an applicant tracking system typically receives no explanation, cannot tell what criterion was applied, and has no means of responding to it. Contemporary evidence is consistent with the model on this point: Lavanchy et al. (2023) found that applicants judge algorithm-driven hiring procedures as less fair than human or human-assisted ones, whether or not the outcome favours them, and Hilliard et al. (2022), reviewing seven studies, report that applicants’ perceptions are most negative in respect of behavioural control, meaning the sense that they are able to influence the result.</w:t>
+      </w:r>
+      <w:r>
+        <w:rPr>
+          <w:rtl w:val="0"/>
+        </w:rPr>
+      </w:r>
+    </w:p>
+    <w:p>
+      <w:pPr>
         <w:spacing w:line="480" w:lineRule="auto"/>
         <w:ind w:firstLine="720"/>
         <w:jc w:val="both"/>
@@ -2019,71 +2084,6 @@
           <w:rtl w:val="0"/>
         </w:rPr>
         <w:t xml:space="preserve">The system developed in this study is designed as a response to those specific deficits rather than to fairness in the abstract. Consistency is addressed by a deterministic rule-based score, so that the same resume and the same posting always yield the same result. Job relatedness is addressed by computing that score only from criteria the recruiter themselves stated in the posting. Explanation is addressed by publishing the weights, showing the applicant the same score the recruiter sees, and naming the required skills their resume did not contain. And the capacity to respond is addressed by leaving every application visible to a human recruiter and by never rejecting anyone automatically. The theory therefore supplies both the reason these design decisions were taken and the terms in which respondents’ accounts of using the system are interpreted.</w:t>
-      </w:r>
-      <w:r>
-        <w:rPr>
-          <w:rtl w:val="0"/>
-        </w:rPr>
-      </w:r>
-    </w:p>
-    <w:p>
-      <w:pPr>
-        <w:spacing w:line="480" w:lineRule="auto"/>
-        <w:ind w:firstLine="720"/>
-        <w:jc w:val="both"/>
-        <w:rPr>
-          <w:sz w:val="20"/>
-          <w:szCs w:val="20"/>
-        </w:rPr>
-      </w:pPr>
-      <w:r>
-        <w:rPr>
-          <w:color w:val="1a1a1a"/>
-          <w:rtl w:val="0"/>
-        </w:rPr>
-        <w:t xml:space="preserve">This theory is relevant to the present study because automated screening removes precisely the elements the model identifies as sources of perceived fairness. An applicant filtered out by an applicant tracking system typically receives no explanation, cannot tell what criterion was applied, and has no means of responding to it. Contemporary evidence is consistent with the model on this point: Lavanchy et al. (2023) found that applicants judge algorithm-driven hiring procedures as less fair than human or human-assisted ones, whether or not the outcome favours them, and Hilliard et al. (2022), reviewing seven studies, report that applicants’ perceptions are most negative in respect of behavioural control, meaning the sense that they are able to influence the result.</w:t>
-      </w:r>
-      <w:r>
-        <w:rPr>
-          <w:rtl w:val="0"/>
-        </w:rPr>
-      </w:r>
-    </w:p>
-    <w:p>
-      <w:pPr>
-        <w:spacing w:line="480" w:lineRule="auto"/>
-        <w:ind w:firstLine="720"/>
-        <w:jc w:val="both"/>
-        <w:rPr>
-          <w:sz w:val="20"/>
-          <w:szCs w:val="20"/>
-        </w:rPr>
-      </w:pPr>
-      <w:r>
-        <w:rPr>
-          <w:color w:val="1a1a1a"/>
-          <w:rtl w:val="0"/>
-        </w:rPr>
-        <w:t>This study is grounded in organisational justice theory as it applies to personnel selection, and specifically in the model advanced by Gilliland (1993). That model proposes that applicants form judgements about the fairness of a selection system according to a set of procedural rules, rather than solely according to whether they are chosen. Among those rules are whether the basis of a decision is related to the job, whether applicants are given adequate information and explanation about how they are being assessed, and whether the procedure is applied consistently from one applicant to the next. The model holds that these perceptions matter in their own right, because they affect how applicants regard the organisation and whether they continue to pursue it.</w:t>
-      </w:r>
-    </w:p>
-    <w:p>
-      <w:pPr>
-        <w:pStyle w:val="Heading1"/>
-        <w:spacing w:line="480" w:lineRule="auto"/>
-        <w:ind w:firstLine="720"/>
-        <w:jc w:val="both"/>
-        <w:rPr>
-          <w:sz w:val="20"/>
-          <w:szCs w:val="20"/>
-        </w:rPr>
-      </w:pPr>
-      <w:r>
-        <w:rPr>
-          <w:color w:val="1a1a1a"/>
-          <w:rtl w:val="0"/>
-        </w:rPr>
-        <w:t xml:space="preserve">Theoretical Framework</w:t>
       </w:r>
       <w:r>
         <w:rPr>

</xml_diff>